<commit_message>
Restyle Habr cover as branded graphic
</commit_message>
<xml_diff>
--- a/dist/Movie Planner MCP - статья для Хабра.docx
+++ b/dist/Movie Planner MCP - статья для Хабра.docx
@@ -10,7 +10,7 @@
       <w:r>
         <w:drawing>
           <wp:inline xmlns:a="http://schemas.openxmlformats.org/drawingml/2006/main" xmlns:pic="http://schemas.openxmlformats.org/drawingml/2006/picture">
-            <wp:extent cx="5940000" cy="3343026"/>
+            <wp:extent cx="5940000" cy="3267000"/>
             <wp:docPr id="1" name="Picture 1"/>
             <wp:cNvGraphicFramePr>
               <a:graphicFrameLocks noChangeAspect="1"/>
@@ -31,7 +31,7 @@
                   <pic:spPr>
                     <a:xfrm>
                       <a:off x="0" y="0"/>
-                      <a:ext cx="5940000" cy="3343026"/>
+                      <a:ext cx="5940000" cy="3267000"/>
                     </a:xfrm>
                     <a:prstGeom prst="rect"/>
                   </pic:spPr>

</xml_diff>

<commit_message>
Use canonical article cover skill
</commit_message>
<xml_diff>
--- a/dist/Movie Planner MCP - статья для Хабра.docx
+++ b/dist/Movie Planner MCP - статья для Хабра.docx
@@ -10,7 +10,7 @@
       <w:r>
         <w:drawing>
           <wp:inline xmlns:a="http://schemas.openxmlformats.org/drawingml/2006/main" xmlns:pic="http://schemas.openxmlformats.org/drawingml/2006/picture">
-            <wp:extent cx="5940000" cy="3267000"/>
+            <wp:extent cx="5940000" cy="3350769"/>
             <wp:docPr id="1" name="Picture 1"/>
             <wp:cNvGraphicFramePr>
               <a:graphicFrameLocks noChangeAspect="1"/>
@@ -31,7 +31,7 @@
                   <pic:spPr>
                     <a:xfrm>
                       <a:off x="0" y="0"/>
-                      <a:ext cx="5940000" cy="3267000"/>
+                      <a:ext cx="5940000" cy="3350769"/>
                     </a:xfrm>
                     <a:prstGeom prst="rect"/>
                   </pic:spPr>

</xml_diff>

<commit_message>
Document ticket to plan MCP flow
</commit_message>
<xml_diff>
--- a/dist/Movie Planner MCP - статья для Хабра.docx
+++ b/dist/Movie Planner MCP - статья для Хабра.docx
@@ -302,7 +302,49 @@
           <w:rFonts w:ascii="Aptos" w:hAnsi="Aptos" w:eastAsia="Aptos"/>
           <w:sz w:val="22"/>
         </w:rPr>
-        <w:t>После покупки билет можно добавить к cinema-плану в Movie Planner. MCP уже умеет прикреплять билет к плану и доставать билеты из планов. Автоматический разбор любого скрина или PDF билета в «дату, время, кинотеатр и план» — отдельная фича: её нужно делать аккуратно, с OCR и проверкой, чтобы не записать человеку неправильное время.</w:t>
+        <w:t xml:space="preserve">После покупки билет можно скинуть агенту прямо в чат. Агент читает скрин или PDF через vision/OCR, передаёт в Movie Planner MCP название фильма, дату, время, кинотеатр и текст билета, а MCP создаёт cinema-план и прикрепляет скрин билета к плану. Для этого есть отдельный маршрут </w:t>
+      </w:r>
+      <w:r>
+        <w:rPr>
+          <w:rFonts w:ascii="Consolas" w:hAnsi="Consolas" w:eastAsia="Consolas"/>
+          <w:color w:val="232323"/>
+          <w:sz w:val="22"/>
+        </w:rPr>
+        <w:t>mp_v1_ticket_to_cinema_plan</w:t>
+      </w:r>
+      <w:r>
+        <w:rPr>
+          <w:rFonts w:ascii="Aptos" w:hAnsi="Aptos" w:eastAsia="Aptos"/>
+          <w:sz w:val="22"/>
+        </w:rPr>
+        <w:t>: он нужен именно для сценария «вот билет, занеси его в мой календарь/планы».</w:t>
+      </w:r>
+    </w:p>
+    <w:p>
+      <w:pPr>
+        <w:spacing w:before="0" w:after="180" w:line="269" w:lineRule="auto"/>
+      </w:pPr>
+      <w:r>
+        <w:rPr>
+          <w:rFonts w:ascii="Aptos" w:hAnsi="Aptos" w:eastAsia="Aptos"/>
+          <w:sz w:val="22"/>
+        </w:rPr>
+        <w:t>Если агент видит только PDF, он сначала использует его как источник текста. Для хранения самого билета Movie Planner сейчас принимает изображение билета (</w:t>
+      </w:r>
+      <w:r>
+        <w:rPr>
+          <w:rFonts w:ascii="Consolas" w:hAnsi="Consolas" w:eastAsia="Consolas"/>
+          <w:color w:val="232323"/>
+          <w:sz w:val="22"/>
+        </w:rPr>
+        <w:t>image_base64</w:t>
+      </w:r>
+      <w:r>
+        <w:rPr>
+          <w:rFonts w:ascii="Aptos" w:hAnsi="Aptos" w:eastAsia="Aptos"/>
+          <w:sz w:val="22"/>
+        </w:rPr>
+        <w:t xml:space="preserve"> JPEG/PNG/GIF), поэтому лучший пользовательский сценарий — отправить скрин билета или картинку из письма/приложения.</w:t>
       </w:r>
     </w:p>
     <w:p>

</xml_diff>